<commit_message>
Fix passport date indices in conclusion/termination (off-by-1); clear hardcoded employer phone from patent notification template
</commit_message>
<xml_diff>
--- a/bot/templates/template_patent_notification.docx
+++ b/bot/templates/template_patent_notification.docx
@@ -33795,351 +33795,343 @@
                 <w:sz w:val="22"/>
                 <w:szCs w:val="22"/>
               </w:rPr>
-              <w:t>8</w:t>
-            </w:r>
-          </w:p>
-        </w:tc>
-        <w:tc>
-          <w:tcPr>
-            <w:tcW w:w="284" w:type="dxa"/>
-            <w:tcBorders>
-              <w:top w:val="single" w:sz="4" w:space="0" w:color="auto"/>
-              <w:left w:val="single" w:sz="4" w:space="0" w:color="auto"/>
-              <w:bottom w:val="single" w:sz="4" w:space="0" w:color="auto"/>
-              <w:right w:val="single" w:sz="4" w:space="0" w:color="auto"/>
-            </w:tcBorders>
-            <w:vAlign w:val="center"/>
-          </w:tcPr>
-          <w:p>
-            <w:pPr>
-              <w:jc w:val="center"/>
-              <w:rPr>
-                <w:sz w:val="22"/>
-                <w:szCs w:val="22"/>
-              </w:rPr>
-            </w:pPr>
-            <w:r>
-              <w:rPr>
-                <w:sz w:val="22"/>
-                <w:szCs w:val="22"/>
-              </w:rPr>
-              <w:t>9</w:t>
-            </w:r>
-          </w:p>
-        </w:tc>
-        <w:tc>
-          <w:tcPr>
-            <w:tcW w:w="284" w:type="dxa"/>
-            <w:tcBorders>
-              <w:top w:val="single" w:sz="4" w:space="0" w:color="auto"/>
-              <w:left w:val="single" w:sz="4" w:space="0" w:color="auto"/>
-              <w:bottom w:val="single" w:sz="4" w:space="0" w:color="auto"/>
-              <w:right w:val="single" w:sz="4" w:space="0" w:color="auto"/>
-            </w:tcBorders>
-            <w:vAlign w:val="center"/>
-          </w:tcPr>
-          <w:p>
-            <w:pPr>
-              <w:jc w:val="center"/>
-              <w:rPr>
-                <w:sz w:val="22"/>
-                <w:szCs w:val="22"/>
-              </w:rPr>
-            </w:pPr>
-            <w:r>
-              <w:rPr>
-                <w:sz w:val="22"/>
-                <w:szCs w:val="22"/>
-              </w:rPr>
-              <w:t>6</w:t>
-            </w:r>
-          </w:p>
-        </w:tc>
-        <w:tc>
-          <w:tcPr>
-            <w:tcW w:w="284" w:type="dxa"/>
-            <w:tcBorders>
-              <w:top w:val="single" w:sz="4" w:space="0" w:color="auto"/>
-              <w:left w:val="single" w:sz="4" w:space="0" w:color="auto"/>
-              <w:bottom w:val="single" w:sz="4" w:space="0" w:color="auto"/>
-              <w:right w:val="single" w:sz="4" w:space="0" w:color="auto"/>
-            </w:tcBorders>
-            <w:vAlign w:val="center"/>
-          </w:tcPr>
-          <w:p>
-            <w:pPr>
-              <w:jc w:val="center"/>
-              <w:rPr>
-                <w:sz w:val="22"/>
-                <w:szCs w:val="22"/>
-              </w:rPr>
-            </w:pPr>
-            <w:r>
-              <w:rPr>
-                <w:sz w:val="22"/>
-                <w:szCs w:val="22"/>
-              </w:rPr>
-              <w:t>0</w:t>
-            </w:r>
-          </w:p>
-        </w:tc>
-        <w:tc>
-          <w:tcPr>
-            <w:tcW w:w="284" w:type="dxa"/>
-            <w:tcBorders>
-              <w:top w:val="single" w:sz="4" w:space="0" w:color="auto"/>
-              <w:left w:val="single" w:sz="4" w:space="0" w:color="auto"/>
-              <w:bottom w:val="single" w:sz="4" w:space="0" w:color="auto"/>
-              <w:right w:val="single" w:sz="4" w:space="0" w:color="auto"/>
-            </w:tcBorders>
-            <w:vAlign w:val="center"/>
-          </w:tcPr>
-          <w:p>
-            <w:pPr>
-              <w:jc w:val="center"/>
-              <w:rPr>
-                <w:sz w:val="22"/>
-                <w:szCs w:val="22"/>
-              </w:rPr>
-            </w:pPr>
-            <w:r>
-              <w:rPr>
-                <w:sz w:val="22"/>
-                <w:szCs w:val="22"/>
-              </w:rPr>
-              <w:t>8</w:t>
-            </w:r>
-          </w:p>
-        </w:tc>
-        <w:tc>
-          <w:tcPr>
-            <w:tcW w:w="284" w:type="dxa"/>
-            <w:tcBorders>
-              <w:top w:val="single" w:sz="4" w:space="0" w:color="auto"/>
-              <w:left w:val="single" w:sz="4" w:space="0" w:color="auto"/>
-              <w:bottom w:val="single" w:sz="4" w:space="0" w:color="auto"/>
-              <w:right w:val="single" w:sz="4" w:space="0" w:color="auto"/>
-            </w:tcBorders>
-            <w:vAlign w:val="center"/>
-          </w:tcPr>
-          <w:p>
-            <w:pPr>
-              <w:jc w:val="center"/>
-              <w:rPr>
-                <w:sz w:val="22"/>
-                <w:szCs w:val="22"/>
-              </w:rPr>
-            </w:pPr>
-            <w:r>
-              <w:rPr>
-                <w:sz w:val="22"/>
-                <w:szCs w:val="22"/>
-              </w:rPr>
-              <w:t>6</w:t>
-            </w:r>
-          </w:p>
-        </w:tc>
-        <w:tc>
-          <w:tcPr>
-            <w:tcW w:w="284" w:type="dxa"/>
-            <w:tcBorders>
-              <w:top w:val="single" w:sz="4" w:space="0" w:color="auto"/>
-              <w:left w:val="single" w:sz="4" w:space="0" w:color="auto"/>
-              <w:bottom w:val="single" w:sz="4" w:space="0" w:color="auto"/>
-              <w:right w:val="single" w:sz="4" w:space="0" w:color="auto"/>
-            </w:tcBorders>
-            <w:vAlign w:val="center"/>
-          </w:tcPr>
-          <w:p>
-            <w:pPr>
-              <w:jc w:val="center"/>
-              <w:rPr>
-                <w:sz w:val="22"/>
-                <w:szCs w:val="22"/>
-              </w:rPr>
-            </w:pPr>
-            <w:r>
-              <w:rPr>
-                <w:sz w:val="22"/>
-                <w:szCs w:val="22"/>
-              </w:rPr>
-              <w:t>2</w:t>
-            </w:r>
-          </w:p>
-        </w:tc>
-        <w:tc>
-          <w:tcPr>
-            <w:tcW w:w="284" w:type="dxa"/>
-            <w:tcBorders>
-              <w:top w:val="single" w:sz="4" w:space="0" w:color="auto"/>
-              <w:left w:val="single" w:sz="4" w:space="0" w:color="auto"/>
-              <w:bottom w:val="single" w:sz="4" w:space="0" w:color="auto"/>
-              <w:right w:val="single" w:sz="4" w:space="0" w:color="auto"/>
-            </w:tcBorders>
-            <w:vAlign w:val="center"/>
-          </w:tcPr>
-          <w:p>
-            <w:pPr>
-              <w:jc w:val="center"/>
-              <w:rPr>
-                <w:sz w:val="22"/>
-                <w:szCs w:val="22"/>
-              </w:rPr>
-            </w:pPr>
-            <w:r>
-              <w:rPr>
-                <w:sz w:val="22"/>
-                <w:szCs w:val="22"/>
-              </w:rPr>
-              <w:t>6</w:t>
-            </w:r>
-          </w:p>
-        </w:tc>
-        <w:tc>
-          <w:tcPr>
-            <w:tcW w:w="284" w:type="dxa"/>
-            <w:tcBorders>
-              <w:top w:val="single" w:sz="4" w:space="0" w:color="auto"/>
-              <w:left w:val="single" w:sz="4" w:space="0" w:color="auto"/>
-              <w:bottom w:val="single" w:sz="4" w:space="0" w:color="auto"/>
-              <w:right w:val="single" w:sz="4" w:space="0" w:color="auto"/>
-            </w:tcBorders>
-            <w:vAlign w:val="center"/>
-          </w:tcPr>
-          <w:p>
-            <w:pPr>
-              <w:jc w:val="center"/>
-              <w:rPr>
-                <w:sz w:val="22"/>
-                <w:szCs w:val="22"/>
-              </w:rPr>
-            </w:pPr>
-            <w:r>
-              <w:rPr>
-                <w:sz w:val="22"/>
-                <w:szCs w:val="22"/>
-              </w:rPr>
-              <w:t>5</w:t>
-            </w:r>
-          </w:p>
-        </w:tc>
-        <w:tc>
-          <w:tcPr>
-            <w:tcW w:w="284" w:type="dxa"/>
-            <w:tcBorders>
-              <w:top w:val="single" w:sz="4" w:space="0" w:color="auto"/>
-              <w:left w:val="single" w:sz="4" w:space="0" w:color="auto"/>
-              <w:bottom w:val="single" w:sz="4" w:space="0" w:color="auto"/>
-              <w:right w:val="single" w:sz="4" w:space="0" w:color="auto"/>
-            </w:tcBorders>
-            <w:vAlign w:val="center"/>
-          </w:tcPr>
-          <w:p>
-            <w:pPr>
-              <w:jc w:val="center"/>
-              <w:rPr>
-                <w:sz w:val="22"/>
-                <w:szCs w:val="22"/>
-              </w:rPr>
-            </w:pPr>
-            <w:r>
-              <w:rPr>
-                <w:sz w:val="22"/>
-                <w:szCs w:val="22"/>
-              </w:rPr>
-              <w:t>9</w:t>
-            </w:r>
-          </w:p>
-        </w:tc>
-        <w:tc>
-          <w:tcPr>
-            <w:tcW w:w="284" w:type="dxa"/>
-            <w:tcBorders>
-              <w:top w:val="single" w:sz="4" w:space="0" w:color="auto"/>
-              <w:left w:val="single" w:sz="4" w:space="0" w:color="auto"/>
-              <w:bottom w:val="single" w:sz="4" w:space="0" w:color="auto"/>
-              <w:right w:val="single" w:sz="4" w:space="0" w:color="auto"/>
-            </w:tcBorders>
-            <w:vAlign w:val="center"/>
-          </w:tcPr>
-          <w:p>
-            <w:pPr>
-              <w:jc w:val="center"/>
-              <w:rPr>
-                <w:sz w:val="22"/>
-                <w:szCs w:val="22"/>
-              </w:rPr>
-            </w:pPr>
-            <w:r>
-              <w:rPr>
-                <w:sz w:val="22"/>
-                <w:szCs w:val="22"/>
-              </w:rPr>
-              <w:t>9</w:t>
-            </w:r>
-          </w:p>
-        </w:tc>
-        <w:tc>
-          <w:tcPr>
-            <w:tcW w:w="284" w:type="dxa"/>
-            <w:tcBorders>
-              <w:top w:val="single" w:sz="4" w:space="0" w:color="auto"/>
-              <w:left w:val="single" w:sz="4" w:space="0" w:color="auto"/>
-              <w:bottom w:val="single" w:sz="4" w:space="0" w:color="auto"/>
-              <w:right w:val="single" w:sz="4" w:space="0" w:color="auto"/>
-            </w:tcBorders>
-            <w:vAlign w:val="center"/>
-          </w:tcPr>
-          <w:p>
-            <w:pPr>
-              <w:jc w:val="center"/>
-              <w:rPr>
-                <w:sz w:val="22"/>
-                <w:szCs w:val="22"/>
-              </w:rPr>
-            </w:pPr>
-          </w:p>
-        </w:tc>
-        <w:tc>
-          <w:tcPr>
-            <w:tcW w:w="284" w:type="dxa"/>
-            <w:tcBorders>
-              <w:top w:val="single" w:sz="4" w:space="0" w:color="auto"/>
-              <w:left w:val="single" w:sz="4" w:space="0" w:color="auto"/>
-              <w:bottom w:val="single" w:sz="4" w:space="0" w:color="auto"/>
-              <w:right w:val="single" w:sz="4" w:space="0" w:color="auto"/>
-            </w:tcBorders>
-            <w:vAlign w:val="center"/>
-          </w:tcPr>
-          <w:p>
-            <w:pPr>
-              <w:jc w:val="center"/>
-              <w:rPr>
-                <w:sz w:val="22"/>
-                <w:szCs w:val="22"/>
-              </w:rPr>
-            </w:pPr>
-          </w:p>
-        </w:tc>
-        <w:tc>
-          <w:tcPr>
-            <w:tcW w:w="284" w:type="dxa"/>
-            <w:tcBorders>
-              <w:top w:val="single" w:sz="4" w:space="0" w:color="auto"/>
-              <w:left w:val="single" w:sz="4" w:space="0" w:color="auto"/>
-              <w:bottom w:val="single" w:sz="4" w:space="0" w:color="auto"/>
-              <w:right w:val="single" w:sz="4" w:space="0" w:color="auto"/>
-            </w:tcBorders>
-            <w:vAlign w:val="center"/>
-          </w:tcPr>
-          <w:p>
-            <w:pPr>
-              <w:jc w:val="center"/>
-              <w:rPr>
-                <w:sz w:val="22"/>
-                <w:szCs w:val="22"/>
-              </w:rPr>
-            </w:pPr>
+            </w:r>
+          </w:p>
+        </w:tc>
+        <w:tc>
+          <w:tcPr>
+            <w:tcW w:w="284" w:type="dxa"/>
+            <w:tcBorders>
+              <w:top w:val="single" w:sz="4" w:space="0" w:color="auto"/>
+              <w:left w:val="single" w:sz="4" w:space="0" w:color="auto"/>
+              <w:bottom w:val="single" w:sz="4" w:space="0" w:color="auto"/>
+              <w:right w:val="single" w:sz="4" w:space="0" w:color="auto"/>
+            </w:tcBorders>
+            <w:vAlign w:val="center"/>
+          </w:tcPr>
+          <w:p>
+            <w:pPr>
+              <w:jc w:val="center"/>
+              <w:rPr>
+                <w:sz w:val="22"/>
+                <w:szCs w:val="22"/>
+              </w:rPr>
+            </w:pPr>
+            <w:r>
+              <w:rPr>
+                <w:sz w:val="22"/>
+                <w:szCs w:val="22"/>
+              </w:rPr>
+            </w:r>
+          </w:p>
+        </w:tc>
+        <w:tc>
+          <w:tcPr>
+            <w:tcW w:w="284" w:type="dxa"/>
+            <w:tcBorders>
+              <w:top w:val="single" w:sz="4" w:space="0" w:color="auto"/>
+              <w:left w:val="single" w:sz="4" w:space="0" w:color="auto"/>
+              <w:bottom w:val="single" w:sz="4" w:space="0" w:color="auto"/>
+              <w:right w:val="single" w:sz="4" w:space="0" w:color="auto"/>
+            </w:tcBorders>
+            <w:vAlign w:val="center"/>
+          </w:tcPr>
+          <w:p>
+            <w:pPr>
+              <w:jc w:val="center"/>
+              <w:rPr>
+                <w:sz w:val="22"/>
+                <w:szCs w:val="22"/>
+              </w:rPr>
+            </w:pPr>
+            <w:r>
+              <w:rPr>
+                <w:sz w:val="22"/>
+                <w:szCs w:val="22"/>
+              </w:rPr>
+            </w:r>
+          </w:p>
+        </w:tc>
+        <w:tc>
+          <w:tcPr>
+            <w:tcW w:w="284" w:type="dxa"/>
+            <w:tcBorders>
+              <w:top w:val="single" w:sz="4" w:space="0" w:color="auto"/>
+              <w:left w:val="single" w:sz="4" w:space="0" w:color="auto"/>
+              <w:bottom w:val="single" w:sz="4" w:space="0" w:color="auto"/>
+              <w:right w:val="single" w:sz="4" w:space="0" w:color="auto"/>
+            </w:tcBorders>
+            <w:vAlign w:val="center"/>
+          </w:tcPr>
+          <w:p>
+            <w:pPr>
+              <w:jc w:val="center"/>
+              <w:rPr>
+                <w:sz w:val="22"/>
+                <w:szCs w:val="22"/>
+              </w:rPr>
+            </w:pPr>
+            <w:r>
+              <w:rPr>
+                <w:sz w:val="22"/>
+                <w:szCs w:val="22"/>
+              </w:rPr>
+            </w:r>
+          </w:p>
+        </w:tc>
+        <w:tc>
+          <w:tcPr>
+            <w:tcW w:w="284" w:type="dxa"/>
+            <w:tcBorders>
+              <w:top w:val="single" w:sz="4" w:space="0" w:color="auto"/>
+              <w:left w:val="single" w:sz="4" w:space="0" w:color="auto"/>
+              <w:bottom w:val="single" w:sz="4" w:space="0" w:color="auto"/>
+              <w:right w:val="single" w:sz="4" w:space="0" w:color="auto"/>
+            </w:tcBorders>
+            <w:vAlign w:val="center"/>
+          </w:tcPr>
+          <w:p>
+            <w:pPr>
+              <w:jc w:val="center"/>
+              <w:rPr>
+                <w:sz w:val="22"/>
+                <w:szCs w:val="22"/>
+              </w:rPr>
+            </w:pPr>
+            <w:r>
+              <w:rPr>
+                <w:sz w:val="22"/>
+                <w:szCs w:val="22"/>
+              </w:rPr>
+            </w:r>
+          </w:p>
+        </w:tc>
+        <w:tc>
+          <w:tcPr>
+            <w:tcW w:w="284" w:type="dxa"/>
+            <w:tcBorders>
+              <w:top w:val="single" w:sz="4" w:space="0" w:color="auto"/>
+              <w:left w:val="single" w:sz="4" w:space="0" w:color="auto"/>
+              <w:bottom w:val="single" w:sz="4" w:space="0" w:color="auto"/>
+              <w:right w:val="single" w:sz="4" w:space="0" w:color="auto"/>
+            </w:tcBorders>
+            <w:vAlign w:val="center"/>
+          </w:tcPr>
+          <w:p>
+            <w:pPr>
+              <w:jc w:val="center"/>
+              <w:rPr>
+                <w:sz w:val="22"/>
+                <w:szCs w:val="22"/>
+              </w:rPr>
+            </w:pPr>
+            <w:r>
+              <w:rPr>
+                <w:sz w:val="22"/>
+                <w:szCs w:val="22"/>
+              </w:rPr>
+            </w:r>
+          </w:p>
+        </w:tc>
+        <w:tc>
+          <w:tcPr>
+            <w:tcW w:w="284" w:type="dxa"/>
+            <w:tcBorders>
+              <w:top w:val="single" w:sz="4" w:space="0" w:color="auto"/>
+              <w:left w:val="single" w:sz="4" w:space="0" w:color="auto"/>
+              <w:bottom w:val="single" w:sz="4" w:space="0" w:color="auto"/>
+              <w:right w:val="single" w:sz="4" w:space="0" w:color="auto"/>
+            </w:tcBorders>
+            <w:vAlign w:val="center"/>
+          </w:tcPr>
+          <w:p>
+            <w:pPr>
+              <w:jc w:val="center"/>
+              <w:rPr>
+                <w:sz w:val="22"/>
+                <w:szCs w:val="22"/>
+              </w:rPr>
+            </w:pPr>
+            <w:r>
+              <w:rPr>
+                <w:sz w:val="22"/>
+                <w:szCs w:val="22"/>
+              </w:rPr>
+            </w:r>
+          </w:p>
+        </w:tc>
+        <w:tc>
+          <w:tcPr>
+            <w:tcW w:w="284" w:type="dxa"/>
+            <w:tcBorders>
+              <w:top w:val="single" w:sz="4" w:space="0" w:color="auto"/>
+              <w:left w:val="single" w:sz="4" w:space="0" w:color="auto"/>
+              <w:bottom w:val="single" w:sz="4" w:space="0" w:color="auto"/>
+              <w:right w:val="single" w:sz="4" w:space="0" w:color="auto"/>
+            </w:tcBorders>
+            <w:vAlign w:val="center"/>
+          </w:tcPr>
+          <w:p>
+            <w:pPr>
+              <w:jc w:val="center"/>
+              <w:rPr>
+                <w:sz w:val="22"/>
+                <w:szCs w:val="22"/>
+              </w:rPr>
+            </w:pPr>
+            <w:r>
+              <w:rPr>
+                <w:sz w:val="22"/>
+                <w:szCs w:val="22"/>
+              </w:rPr>
+            </w:r>
+          </w:p>
+        </w:tc>
+        <w:tc>
+          <w:tcPr>
+            <w:tcW w:w="284" w:type="dxa"/>
+            <w:tcBorders>
+              <w:top w:val="single" w:sz="4" w:space="0" w:color="auto"/>
+              <w:left w:val="single" w:sz="4" w:space="0" w:color="auto"/>
+              <w:bottom w:val="single" w:sz="4" w:space="0" w:color="auto"/>
+              <w:right w:val="single" w:sz="4" w:space="0" w:color="auto"/>
+            </w:tcBorders>
+            <w:vAlign w:val="center"/>
+          </w:tcPr>
+          <w:p>
+            <w:pPr>
+              <w:jc w:val="center"/>
+              <w:rPr>
+                <w:sz w:val="22"/>
+                <w:szCs w:val="22"/>
+              </w:rPr>
+            </w:pPr>
+            <w:r>
+              <w:rPr>
+                <w:sz w:val="22"/>
+                <w:szCs w:val="22"/>
+              </w:rPr>
+            </w:r>
+          </w:p>
+        </w:tc>
+        <w:tc>
+          <w:tcPr>
+            <w:tcW w:w="284" w:type="dxa"/>
+            <w:tcBorders>
+              <w:top w:val="single" w:sz="4" w:space="0" w:color="auto"/>
+              <w:left w:val="single" w:sz="4" w:space="0" w:color="auto"/>
+              <w:bottom w:val="single" w:sz="4" w:space="0" w:color="auto"/>
+              <w:right w:val="single" w:sz="4" w:space="0" w:color="auto"/>
+            </w:tcBorders>
+            <w:vAlign w:val="center"/>
+          </w:tcPr>
+          <w:p>
+            <w:pPr>
+              <w:jc w:val="center"/>
+              <w:rPr>
+                <w:sz w:val="22"/>
+                <w:szCs w:val="22"/>
+              </w:rPr>
+            </w:pPr>
+            <w:r>
+              <w:rPr>
+                <w:sz w:val="22"/>
+                <w:szCs w:val="22"/>
+              </w:rPr>
+            </w:r>
+          </w:p>
+        </w:tc>
+        <w:tc>
+          <w:tcPr>
+            <w:tcW w:w="284" w:type="dxa"/>
+            <w:tcBorders>
+              <w:top w:val="single" w:sz="4" w:space="0" w:color="auto"/>
+              <w:left w:val="single" w:sz="4" w:space="0" w:color="auto"/>
+              <w:bottom w:val="single" w:sz="4" w:space="0" w:color="auto"/>
+              <w:right w:val="single" w:sz="4" w:space="0" w:color="auto"/>
+            </w:tcBorders>
+            <w:vAlign w:val="center"/>
+          </w:tcPr>
+          <w:p>
+            <w:pPr>
+              <w:jc w:val="center"/>
+              <w:rPr>
+                <w:sz w:val="22"/>
+                <w:szCs w:val="22"/>
+              </w:rPr>
+            </w:pPr>
+            <w:r>
+              <w:rPr>
+                <w:sz w:val="22"/>
+                <w:szCs w:val="22"/>
+              </w:rPr>
+            </w:r>
+          </w:p>
+        </w:tc>
+        <w:tc>
+          <w:tcPr>
+            <w:tcW w:w="284" w:type="dxa"/>
+            <w:tcBorders>
+              <w:top w:val="single" w:sz="4" w:space="0" w:color="auto"/>
+              <w:left w:val="single" w:sz="4" w:space="0" w:color="auto"/>
+              <w:bottom w:val="single" w:sz="4" w:space="0" w:color="auto"/>
+              <w:right w:val="single" w:sz="4" w:space="0" w:color="auto"/>
+            </w:tcBorders>
+            <w:vAlign w:val="center"/>
+          </w:tcPr>
+          <w:p>
+            <w:pPr>
+              <w:jc w:val="center"/>
+              <w:rPr>
+                <w:sz w:val="22"/>
+                <w:szCs w:val="22"/>
+              </w:rPr>
+            </w:pPr>
+            <w:r/>
+          </w:p>
+        </w:tc>
+        <w:tc>
+          <w:tcPr>
+            <w:tcW w:w="284" w:type="dxa"/>
+            <w:tcBorders>
+              <w:top w:val="single" w:sz="4" w:space="0" w:color="auto"/>
+              <w:left w:val="single" w:sz="4" w:space="0" w:color="auto"/>
+              <w:bottom w:val="single" w:sz="4" w:space="0" w:color="auto"/>
+              <w:right w:val="single" w:sz="4" w:space="0" w:color="auto"/>
+            </w:tcBorders>
+            <w:vAlign w:val="center"/>
+          </w:tcPr>
+          <w:p>
+            <w:pPr>
+              <w:jc w:val="center"/>
+              <w:rPr>
+                <w:sz w:val="22"/>
+                <w:szCs w:val="22"/>
+              </w:rPr>
+            </w:pPr>
+            <w:r/>
+          </w:p>
+        </w:tc>
+        <w:tc>
+          <w:tcPr>
+            <w:tcW w:w="284" w:type="dxa"/>
+            <w:tcBorders>
+              <w:top w:val="single" w:sz="4" w:space="0" w:color="auto"/>
+              <w:left w:val="single" w:sz="4" w:space="0" w:color="auto"/>
+              <w:bottom w:val="single" w:sz="4" w:space="0" w:color="auto"/>
+              <w:right w:val="single" w:sz="4" w:space="0" w:color="auto"/>
+            </w:tcBorders>
+            <w:vAlign w:val="center"/>
+          </w:tcPr>
+          <w:p>
+            <w:pPr>
+              <w:jc w:val="center"/>
+              <w:rPr>
+                <w:sz w:val="22"/>
+                <w:szCs w:val="22"/>
+              </w:rPr>
+            </w:pPr>
+            <w:r/>
           </w:p>
         </w:tc>
         <w:tc>

</xml_diff>